<commit_message>
Made edits to the paper
</commit_message>
<xml_diff>
--- a/Wines of the Word Project Writeup.docx
+++ b/Wines of the Word Project Writeup.docx
@@ -64,28 +64,164 @@
         <w:spacing w:line="480" w:lineRule="auto"/>
         <w:ind w:firstLine="720"/>
         <w:rPr>
-          <w:rFonts w:ascii="Times New Roman" w:hAnsi="Times New Roman" w:cs="Times New Roman"/>
-        </w:rPr>
-      </w:pPr>
-      <w:r>
-        <w:rPr>
-          <w:rFonts w:ascii="Times New Roman" w:hAnsi="Times New Roman" w:cs="Times New Roman"/>
-        </w:rPr>
-        <w:t xml:space="preserve">This writeup serves as the written component of the HSPT.161 Wines of the World project. This paper explains the process, research foundation, and what was learned during the creation of the wines of the world project. This project submission contains this written component, as well as our visual product, </w:t>
-      </w:r>
+          <w:del w:id="0" w:author="Sarah Payne (RIT Student)" w:date="2026-04-09T15:49:00Z" w16du:dateUtc="2026-04-09T19:49:00Z"/>
+          <w:rFonts w:ascii="Times New Roman" w:hAnsi="Times New Roman" w:cs="Times New Roman"/>
+        </w:rPr>
+      </w:pPr>
+      <w:del w:id="1" w:author="Sarah Payne (RIT Student)" w:date="2026-04-09T15:49:00Z" w16du:dateUtc="2026-04-09T19:49:00Z">
+        <w:r>
+          <w:rPr>
+            <w:rFonts w:ascii="Times New Roman" w:hAnsi="Times New Roman" w:cs="Times New Roman"/>
+          </w:rPr>
+          <w:delText xml:space="preserve">This writeup serves as the written component of the HSPT.161 Wines of the World project. This paper explains the process, research foundation, and what was learned during the creation of the wines of the world project. This project submission contains this written component, as well as our visual product, </w:delText>
+        </w:r>
+        <w:r>
+          <w:rPr>
+            <w:rFonts w:ascii="Times New Roman" w:hAnsi="Times New Roman" w:cs="Times New Roman"/>
+            <w:i/>
+            <w:iCs/>
+          </w:rPr>
+          <w:delText>Journey of the Grape</w:delText>
+        </w:r>
+        <w:r>
+          <w:rPr>
+            <w:rFonts w:ascii="Times New Roman" w:hAnsi="Times New Roman" w:cs="Times New Roman"/>
+          </w:rPr>
+          <w:delText xml:space="preserve">. </w:delText>
+        </w:r>
+      </w:del>
+    </w:p>
+    <w:p>
+      <w:pPr>
+        <w:spacing w:line="480" w:lineRule="auto"/>
+        <w:ind w:firstLine="720"/>
+        <w:rPr>
+          <w:rFonts w:ascii="Times New Roman" w:hAnsi="Times New Roman" w:cs="Times New Roman"/>
+        </w:rPr>
+      </w:pPr>
       <w:r>
         <w:rPr>
           <w:rFonts w:ascii="Times New Roman" w:hAnsi="Times New Roman" w:cs="Times New Roman"/>
           <w:i/>
           <w:iCs/>
         </w:rPr>
-        <w:t>Journey of the Grape</w:t>
-      </w:r>
-      <w:r>
-        <w:rPr>
-          <w:rFonts w:ascii="Times New Roman" w:hAnsi="Times New Roman" w:cs="Times New Roman"/>
-        </w:rPr>
-        <w:t xml:space="preserve">. </w:t>
+        <w:t>Journey of a Grape</w:t>
+      </w:r>
+      <w:r>
+        <w:rPr>
+          <w:rFonts w:ascii="Times New Roman" w:hAnsi="Times New Roman" w:cs="Times New Roman"/>
+        </w:rPr>
+        <w:t xml:space="preserve"> is an interactive, web-based educational experience where the user </w:t>
+      </w:r>
+      <w:del w:id="2" w:author="Sarah Payne (RIT Student)" w:date="2026-04-09T15:49:00Z" w16du:dateUtc="2026-04-09T19:49:00Z">
+        <w:r>
+          <w:rPr>
+            <w:rFonts w:ascii="Times New Roman" w:hAnsi="Times New Roman" w:cs="Times New Roman"/>
+          </w:rPr>
+          <w:delText>selects a grape type</w:delText>
+        </w:r>
+      </w:del>
+      <w:ins w:id="3" w:author="Sarah Payne (RIT Student)" w:date="2026-04-09T15:49:00Z" w16du:dateUtc="2026-04-09T19:49:00Z">
+        <w:r>
+          <w:rPr>
+            <w:rFonts w:ascii="Times New Roman" w:hAnsi="Times New Roman" w:cs="Times New Roman"/>
+          </w:rPr>
+          <w:t>chooses a type of grape as their character</w:t>
+        </w:r>
+      </w:ins>
+      <w:r>
+        <w:rPr>
+          <w:rFonts w:ascii="Times New Roman" w:hAnsi="Times New Roman" w:cs="Times New Roman"/>
+        </w:rPr>
+        <w:t xml:space="preserve"> and </w:t>
+      </w:r>
+      <w:del w:id="4" w:author="Sarah Payne (RIT Student)" w:date="2026-04-09T15:50:00Z" w16du:dateUtc="2026-04-09T19:50:00Z">
+        <w:r>
+          <w:rPr>
+            <w:rFonts w:ascii="Times New Roman" w:hAnsi="Times New Roman" w:cs="Times New Roman"/>
+          </w:rPr>
+          <w:delText>navigates it through a vineyard-themed maze</w:delText>
+        </w:r>
+      </w:del>
+      <w:ins w:id="5" w:author="Sarah Payne (RIT Student)" w:date="2026-04-09T15:50:00Z" w16du:dateUtc="2026-04-09T19:50:00Z">
+        <w:r>
+          <w:rPr>
+            <w:rFonts w:ascii="Times New Roman" w:hAnsi="Times New Roman" w:cs="Times New Roman"/>
+          </w:rPr>
+          <w:t>explores a vineyard</w:t>
+        </w:r>
+      </w:ins>
+      <w:r>
+        <w:rPr>
+          <w:rFonts w:ascii="Times New Roman" w:hAnsi="Times New Roman" w:cs="Times New Roman"/>
+        </w:rPr>
+        <w:t>, discovering and learning about 10 different wine packaging methods. These</w:t>
+      </w:r>
+      <w:del w:id="6" w:author="Sarah Payne (RIT Student)" w:date="2026-04-09T15:50:00Z" w16du:dateUtc="2026-04-09T19:50:00Z">
+        <w:r>
+          <w:rPr>
+            <w:rFonts w:ascii="Times New Roman" w:hAnsi="Times New Roman" w:cs="Times New Roman"/>
+          </w:rPr>
+          <w:delText xml:space="preserve"> packing</w:delText>
+        </w:r>
+      </w:del>
+      <w:r>
+        <w:rPr>
+          <w:rFonts w:ascii="Times New Roman" w:hAnsi="Times New Roman" w:cs="Times New Roman"/>
+        </w:rPr>
+        <w:t xml:space="preserve"> methods </w:t>
+      </w:r>
+      <w:ins w:id="7" w:author="Sarah Payne (RIT Student)" w:date="2026-04-09T15:50:00Z" w16du:dateUtc="2026-04-09T19:50:00Z">
+        <w:r>
+          <w:rPr>
+            <w:rFonts w:ascii="Times New Roman" w:hAnsi="Times New Roman" w:cs="Times New Roman"/>
+          </w:rPr>
+          <w:t xml:space="preserve">ranging </w:t>
+        </w:r>
+      </w:ins>
+      <w:del w:id="8" w:author="Sarah Payne (RIT Student)" w:date="2026-04-09T15:50:00Z" w16du:dateUtc="2026-04-09T19:50:00Z">
+        <w:r>
+          <w:rPr>
+            <w:rFonts w:ascii="Times New Roman" w:hAnsi="Times New Roman" w:cs="Times New Roman"/>
+          </w:rPr>
+          <w:delText xml:space="preserve">span </w:delText>
+        </w:r>
+      </w:del>
+      <w:r>
+        <w:rPr>
+          <w:rFonts w:ascii="Times New Roman" w:hAnsi="Times New Roman" w:cs="Times New Roman"/>
+        </w:rPr>
+        <w:t xml:space="preserve">from natural cork and screw caps to bag-in-box and tetra </w:t>
+      </w:r>
+      <w:proofErr w:type="spellStart"/>
+      <w:r>
+        <w:rPr>
+          <w:rFonts w:ascii="Times New Roman" w:hAnsi="Times New Roman" w:cs="Times New Roman"/>
+        </w:rPr>
+        <w:t>paks</w:t>
+      </w:r>
+      <w:proofErr w:type="spellEnd"/>
+      <w:ins w:id="9" w:author="Sarah Payne (RIT Student)" w:date="2026-04-09T15:50:00Z" w16du:dateUtc="2026-04-09T19:50:00Z">
+        <w:r>
+          <w:rPr>
+            <w:rFonts w:ascii="Times New Roman" w:hAnsi="Times New Roman" w:cs="Times New Roman"/>
+          </w:rPr>
+          <w:t xml:space="preserve"> cover almost every way wine can be </w:t>
+        </w:r>
+      </w:ins>
+      <w:ins w:id="10" w:author="Sarah Payne (RIT Student)" w:date="2026-04-09T15:51:00Z" w16du:dateUtc="2026-04-09T19:51:00Z">
+        <w:r>
+          <w:rPr>
+            <w:rFonts w:ascii="Times New Roman" w:hAnsi="Times New Roman" w:cs="Times New Roman"/>
+          </w:rPr>
+          <w:t>packaged for sale</w:t>
+        </w:r>
+      </w:ins>
+      <w:r>
+        <w:rPr>
+          <w:rFonts w:ascii="Times New Roman" w:hAnsi="Times New Roman" w:cs="Times New Roman"/>
+        </w:rPr>
+        <w:t xml:space="preserve">. The experience explores how each closure and container affects wine quality, flavor, sustainability, and cost. </w:t>
       </w:r>
     </w:p>
     <w:p>
@@ -96,19 +232,182 @@
           <w:rFonts w:ascii="Times New Roman" w:hAnsi="Times New Roman" w:cs="Times New Roman"/>
         </w:rPr>
       </w:pPr>
-      <w:r>
-        <w:rPr>
-          <w:rFonts w:ascii="Times New Roman" w:hAnsi="Times New Roman" w:cs="Times New Roman"/>
-          <w:i/>
-          <w:iCs/>
-        </w:rPr>
-        <w:t>Journey of a Grape</w:t>
-      </w:r>
-      <w:r>
-        <w:rPr>
-          <w:rFonts w:ascii="Times New Roman" w:hAnsi="Times New Roman" w:cs="Times New Roman"/>
-        </w:rPr>
-        <w:t xml:space="preserve"> is an interactive, web-based educational experience where the user selects a grape type and navigates it through a vineyard-themed maze, discovering and learning about 10 different wine packaging methods. These packing methods span from natural cork and screw caps to bag-in-box and tetra paks. The experience explores how each closure and container affects wine quality, flavor, sustainability, and cost. </w:t>
+      <w:del w:id="11" w:author="Sarah Payne (RIT Student)" w:date="2026-04-09T15:51:00Z" w16du:dateUtc="2026-04-09T19:51:00Z">
+        <w:r>
+          <w:rPr>
+            <w:rFonts w:ascii="Times New Roman" w:hAnsi="Times New Roman" w:cs="Times New Roman"/>
+          </w:rPr>
+          <w:delText>The implementation of this project consisted of a multi-step process. The first step, ideation.</w:delText>
+        </w:r>
+      </w:del>
+      <w:ins w:id="12" w:author="Sarah Payne (RIT Student)" w:date="2026-04-09T15:56:00Z" w16du:dateUtc="2026-04-09T19:56:00Z">
+        <w:r>
+          <w:rPr>
+            <w:rFonts w:ascii="Times New Roman" w:hAnsi="Times New Roman" w:cs="Times New Roman"/>
+          </w:rPr>
+          <w:t xml:space="preserve">We </w:t>
+        </w:r>
+      </w:ins>
+      <w:ins w:id="13" w:author="Sarah Payne (RIT Student)" w:date="2026-04-09T15:57:00Z" w16du:dateUtc="2026-04-09T19:57:00Z">
+        <w:r>
+          <w:rPr>
+            <w:rFonts w:ascii="Times New Roman" w:hAnsi="Times New Roman" w:cs="Times New Roman"/>
+          </w:rPr>
+          <w:t>thought about what parts of the winemaking process we were interested in further resear</w:t>
+        </w:r>
+      </w:ins>
+      <w:ins w:id="14" w:author="Sarah Payne (RIT Student)" w:date="2026-04-09T15:58:00Z" w16du:dateUtc="2026-04-09T19:58:00Z">
+        <w:r>
+          <w:rPr>
+            <w:rFonts w:ascii="Times New Roman" w:hAnsi="Times New Roman" w:cs="Times New Roman"/>
+          </w:rPr>
+          <w:t>ching and decided on consumer packaging</w:t>
+        </w:r>
+      </w:ins>
+      <w:ins w:id="15" w:author="Sarah Payne (RIT Student)" w:date="2026-04-09T15:59:00Z" w16du:dateUtc="2026-04-09T19:59:00Z">
+        <w:r>
+          <w:rPr>
+            <w:rFonts w:ascii="Times New Roman" w:hAnsi="Times New Roman" w:cs="Times New Roman"/>
+          </w:rPr>
+          <w:t>, especiall</w:t>
+        </w:r>
+      </w:ins>
+      <w:ins w:id="16" w:author="Sarah Payne (RIT Student)" w:date="2026-04-09T16:00:00Z" w16du:dateUtc="2026-04-09T20:00:00Z">
+        <w:r>
+          <w:rPr>
+            <w:rFonts w:ascii="Times New Roman" w:hAnsi="Times New Roman" w:cs="Times New Roman"/>
+          </w:rPr>
+          <w:t>y the increasingly popular alternative methods to packaging in a glass bottle</w:t>
+        </w:r>
+      </w:ins>
+      <w:ins w:id="17" w:author="Sarah Payne (RIT Student)" w:date="2026-04-09T15:58:00Z" w16du:dateUtc="2026-04-09T19:58:00Z">
+        <w:r>
+          <w:rPr>
+            <w:rFonts w:ascii="Times New Roman" w:hAnsi="Times New Roman" w:cs="Times New Roman"/>
+          </w:rPr>
+          <w:t xml:space="preserve">. </w:t>
+        </w:r>
+        <w:r>
+          <w:rPr>
+            <w:rFonts w:ascii="Times New Roman" w:hAnsi="Times New Roman" w:cs="Times New Roman"/>
+          </w:rPr>
+          <w:t xml:space="preserve">Considering our academic backgrounds, we decided to </w:t>
+        </w:r>
+      </w:ins>
+      <w:ins w:id="18" w:author="Sarah Payne (RIT Student)" w:date="2026-04-09T15:59:00Z" w16du:dateUtc="2026-04-09T19:59:00Z">
+        <w:r>
+          <w:rPr>
+            <w:rFonts w:ascii="Times New Roman" w:hAnsi="Times New Roman" w:cs="Times New Roman"/>
+          </w:rPr>
+          <w:t>create a simple educational game</w:t>
+        </w:r>
+      </w:ins>
+      <w:ins w:id="19" w:author="Sarah Payne (RIT Student)" w:date="2026-04-09T16:01:00Z" w16du:dateUtc="2026-04-09T20:01:00Z">
+        <w:r>
+          <w:rPr>
+            <w:rFonts w:ascii="Times New Roman" w:hAnsi="Times New Roman" w:cs="Times New Roman"/>
+          </w:rPr>
+          <w:t xml:space="preserve"> to deliver our research information. </w:t>
+        </w:r>
+      </w:ins>
+      <w:del w:id="20" w:author="Sarah Payne (RIT Student)" w:date="2026-04-09T15:55:00Z" w16du:dateUtc="2026-04-09T19:55:00Z">
+        <w:r>
+          <w:rPr>
+            <w:rFonts w:ascii="Times New Roman" w:hAnsi="Times New Roman" w:cs="Times New Roman"/>
+          </w:rPr>
+          <w:delText xml:space="preserve"> </w:delText>
+        </w:r>
+      </w:del>
+      <w:del w:id="21" w:author="Sarah Payne (RIT Student)" w:date="2026-04-09T16:01:00Z" w16du:dateUtc="2026-04-09T20:01:00Z">
+        <w:r>
+          <w:rPr>
+            <w:rFonts w:ascii="Times New Roman" w:hAnsi="Times New Roman" w:cs="Times New Roman"/>
+          </w:rPr>
+          <w:delText>We</w:delText>
+        </w:r>
+        <w:r>
+          <w:rPr>
+            <w:rFonts w:ascii="Times New Roman" w:hAnsi="Times New Roman" w:cs="Times New Roman"/>
+          </w:rPr>
+          <w:delText xml:space="preserve"> agreed on producing an interactive game like experience, with the goal of creating both an engaging but informational experience. Considering </w:delText>
+        </w:r>
+        <w:r>
+          <w:rPr>
+            <w:rFonts w:ascii="Times New Roman" w:hAnsi="Times New Roman" w:cs="Times New Roman"/>
+          </w:rPr>
+          <w:delText xml:space="preserve">our </w:delText>
+        </w:r>
+        <w:r>
+          <w:rPr>
+            <w:rFonts w:ascii="Times New Roman" w:hAnsi="Times New Roman" w:cs="Times New Roman"/>
+          </w:rPr>
+          <w:delText xml:space="preserve">background as computer science majors, we decided to create a </w:delText>
+        </w:r>
+      </w:del>
+      <w:del w:id="22" w:author="Sarah Payne (RIT Student)" w:date="2026-04-09T15:52:00Z" w16du:dateUtc="2026-04-09T19:52:00Z">
+        <w:r>
+          <w:rPr>
+            <w:rFonts w:ascii="Times New Roman" w:hAnsi="Times New Roman" w:cs="Times New Roman"/>
+          </w:rPr>
+          <w:delText>web based</w:delText>
+        </w:r>
+      </w:del>
+      <w:del w:id="23" w:author="Sarah Payne (RIT Student)" w:date="2026-04-09T16:01:00Z" w16du:dateUtc="2026-04-09T20:01:00Z">
+        <w:r>
+          <w:rPr>
+            <w:rFonts w:ascii="Times New Roman" w:hAnsi="Times New Roman" w:cs="Times New Roman"/>
+          </w:rPr>
+          <w:delText xml:space="preserve"> game. Throughout the course, we have been interested in the pros and cons of different wine packaging methods, especially regarding perception. </w:delText>
+        </w:r>
+        <w:r>
+          <w:rPr>
+            <w:rFonts w:ascii="Times New Roman" w:hAnsi="Times New Roman" w:cs="Times New Roman"/>
+          </w:rPr>
+          <w:delText xml:space="preserve">Alternative wine packaging methods continue to become increasingly popular. We wanted to gather an understanding of this evolving </w:delText>
+        </w:r>
+        <w:r>
+          <w:rPr>
+            <w:rFonts w:ascii="Times New Roman" w:hAnsi="Times New Roman" w:cs="Times New Roman"/>
+          </w:rPr>
+          <w:lastRenderedPageBreak/>
+          <w:delText xml:space="preserve">landscape, develop accurate understandings of each method, and dissolve false claims </w:delText>
+        </w:r>
+        <w:r>
+          <w:rPr>
+            <w:rFonts w:ascii="Times New Roman" w:hAnsi="Times New Roman" w:cs="Times New Roman"/>
+          </w:rPr>
+          <w:delText xml:space="preserve">impacting </w:delText>
+        </w:r>
+        <w:r>
+          <w:rPr>
+            <w:rFonts w:ascii="Times New Roman" w:hAnsi="Times New Roman" w:cs="Times New Roman"/>
+          </w:rPr>
+          <w:delText xml:space="preserve">perception. </w:delText>
+        </w:r>
+      </w:del>
+      <w:r>
+        <w:rPr>
+          <w:rFonts w:ascii="Times New Roman" w:hAnsi="Times New Roman" w:cs="Times New Roman"/>
+        </w:rPr>
+        <w:t>We</w:t>
+      </w:r>
+      <w:r>
+        <w:rPr>
+          <w:rFonts w:ascii="Times New Roman" w:hAnsi="Times New Roman" w:cs="Times New Roman"/>
+        </w:rPr>
+        <w:t xml:space="preserve"> selected a list of packaging methods </w:t>
+      </w:r>
+      <w:r>
+        <w:rPr>
+          <w:rFonts w:ascii="Times New Roman" w:hAnsi="Times New Roman" w:cs="Times New Roman"/>
+        </w:rPr>
+        <w:t>to</w:t>
+      </w:r>
+      <w:r>
+        <w:rPr>
+          <w:rFonts w:ascii="Times New Roman" w:hAnsi="Times New Roman" w:cs="Times New Roman"/>
+        </w:rPr>
+        <w:t xml:space="preserve"> cover and began research. </w:t>
       </w:r>
     </w:p>
     <w:p>
@@ -119,72 +418,216 @@
           <w:rFonts w:ascii="Times New Roman" w:hAnsi="Times New Roman" w:cs="Times New Roman"/>
         </w:rPr>
       </w:pPr>
-      <w:r>
-        <w:rPr>
-          <w:rFonts w:ascii="Times New Roman" w:hAnsi="Times New Roman" w:cs="Times New Roman"/>
-        </w:rPr>
-        <w:t xml:space="preserve">The implementation of this project consisted of a multi-step process. The first step, ideation. </w:t>
-      </w:r>
-      <w:r>
-        <w:rPr>
-          <w:rFonts w:ascii="Times New Roman" w:hAnsi="Times New Roman" w:cs="Times New Roman"/>
-        </w:rPr>
-        <w:t>We</w:t>
-      </w:r>
-      <w:r>
-        <w:rPr>
-          <w:rFonts w:ascii="Times New Roman" w:hAnsi="Times New Roman" w:cs="Times New Roman"/>
-        </w:rPr>
-        <w:t xml:space="preserve"> agreed on producing an interactive game like experience, with the goal of creating both an engaging but informational experience. Considering </w:t>
-      </w:r>
-      <w:r>
-        <w:rPr>
-          <w:rFonts w:ascii="Times New Roman" w:hAnsi="Times New Roman" w:cs="Times New Roman"/>
-        </w:rPr>
-        <w:t xml:space="preserve">our </w:t>
-      </w:r>
-      <w:r>
-        <w:rPr>
-          <w:rFonts w:ascii="Times New Roman" w:hAnsi="Times New Roman" w:cs="Times New Roman"/>
-        </w:rPr>
-        <w:t xml:space="preserve">background as computer science majors, we decided to create a web based game. Throughout the course, we have been interested in the pros and cons of different wine packaging methods, especially regarding perception. </w:t>
-      </w:r>
-      <w:r>
-        <w:rPr>
-          <w:rFonts w:ascii="Times New Roman" w:hAnsi="Times New Roman" w:cs="Times New Roman"/>
-        </w:rPr>
-        <w:t xml:space="preserve">Alternative wine packaging methods continue to become increasingly popular. We wanted to gather an understanding of this evolving landscape, develop accurate understandings of each method, and dissolve false claims </w:t>
-      </w:r>
-      <w:r>
-        <w:rPr>
-          <w:rFonts w:ascii="Times New Roman" w:hAnsi="Times New Roman" w:cs="Times New Roman"/>
-        </w:rPr>
-        <w:t xml:space="preserve">impacting </w:t>
-      </w:r>
-      <w:r>
-        <w:rPr>
-          <w:rFonts w:ascii="Times New Roman" w:hAnsi="Times New Roman" w:cs="Times New Roman"/>
-        </w:rPr>
-        <w:t>perception. We</w:t>
-      </w:r>
-      <w:r>
-        <w:rPr>
-          <w:rFonts w:ascii="Times New Roman" w:hAnsi="Times New Roman" w:cs="Times New Roman"/>
-        </w:rPr>
-        <w:t xml:space="preserve"> selected a list of packaging methods </w:t>
-      </w:r>
-      <w:r>
-        <w:rPr>
-          <w:rFonts w:ascii="Times New Roman" w:hAnsi="Times New Roman" w:cs="Times New Roman"/>
-        </w:rPr>
-        <w:t>to</w:t>
-      </w:r>
-      <w:r>
-        <w:rPr>
-          <w:rFonts w:ascii="Times New Roman" w:hAnsi="Times New Roman" w:cs="Times New Roman"/>
-        </w:rPr>
-        <w:t xml:space="preserve"> cover and began research. </w:t>
-      </w:r>
+      <w:ins w:id="24" w:author="Sarah Payne (RIT Student)" w:date="2026-04-09T16:01:00Z" w16du:dateUtc="2026-04-09T20:01:00Z">
+        <w:r>
+          <w:rPr>
+            <w:rFonts w:ascii="Times New Roman" w:hAnsi="Times New Roman" w:cs="Times New Roman"/>
+          </w:rPr>
+          <w:t>We</w:t>
+        </w:r>
+      </w:ins>
+      <w:del w:id="25" w:author="Sarah Payne (RIT Student)" w:date="2026-04-09T16:01:00Z" w16du:dateUtc="2026-04-09T20:01:00Z">
+        <w:r>
+          <w:rPr>
+            <w:rFonts w:ascii="Times New Roman" w:hAnsi="Times New Roman" w:cs="Times New Roman"/>
+          </w:rPr>
+          <w:delText>The team</w:delText>
+        </w:r>
+      </w:del>
+      <w:r>
+        <w:rPr>
+          <w:rFonts w:ascii="Times New Roman" w:hAnsi="Times New Roman" w:cs="Times New Roman"/>
+        </w:rPr>
+        <w:t xml:space="preserve"> worked together to </w:t>
+      </w:r>
+      <w:ins w:id="26" w:author="Sarah Payne (RIT Student)" w:date="2026-04-09T16:03:00Z" w16du:dateUtc="2026-04-09T20:03:00Z">
+        <w:r>
+          <w:rPr>
+            <w:rFonts w:ascii="Times New Roman" w:hAnsi="Times New Roman" w:cs="Times New Roman"/>
+          </w:rPr>
+          <w:t>gather</w:t>
+        </w:r>
+      </w:ins>
+      <w:del w:id="27" w:author="Sarah Payne (RIT Student)" w:date="2026-04-09T16:01:00Z" w16du:dateUtc="2026-04-09T20:01:00Z">
+        <w:r>
+          <w:rPr>
+            <w:rFonts w:ascii="Times New Roman" w:hAnsi="Times New Roman" w:cs="Times New Roman"/>
+          </w:rPr>
+          <w:delText>perform</w:delText>
+        </w:r>
+      </w:del>
+      <w:r>
+        <w:rPr>
+          <w:rFonts w:ascii="Times New Roman" w:hAnsi="Times New Roman" w:cs="Times New Roman"/>
+        </w:rPr>
+        <w:t xml:space="preserve"> research, </w:t>
+      </w:r>
+      <w:del w:id="28" w:author="Sarah Payne (RIT Student)" w:date="2026-04-09T16:04:00Z" w16du:dateUtc="2026-04-09T20:04:00Z">
+        <w:r>
+          <w:rPr>
+            <w:rFonts w:ascii="Times New Roman" w:hAnsi="Times New Roman" w:cs="Times New Roman"/>
+          </w:rPr>
+          <w:delText xml:space="preserve">synthesizing data from </w:delText>
+        </w:r>
+      </w:del>
+      <w:ins w:id="29" w:author="Sarah Payne (RIT Student)" w:date="2026-04-09T16:04:00Z" w16du:dateUtc="2026-04-09T20:04:00Z">
+        <w:r>
+          <w:rPr>
+            <w:rFonts w:ascii="Times New Roman" w:hAnsi="Times New Roman" w:cs="Times New Roman"/>
+          </w:rPr>
+          <w:t xml:space="preserve">using </w:t>
+        </w:r>
+      </w:ins>
+      <w:r>
+        <w:rPr>
+          <w:rFonts w:ascii="Times New Roman" w:hAnsi="Times New Roman" w:cs="Times New Roman"/>
+        </w:rPr>
+        <w:t>peer-reviewed research, industry data, and lifecycle assessments</w:t>
+      </w:r>
+      <w:ins w:id="30" w:author="Sarah Payne (RIT Student)" w:date="2026-04-09T16:04:00Z" w16du:dateUtc="2026-04-09T20:04:00Z">
+        <w:r>
+          <w:rPr>
+            <w:rFonts w:ascii="Times New Roman" w:hAnsi="Times New Roman" w:cs="Times New Roman"/>
+          </w:rPr>
+          <w:t xml:space="preserve"> as sources</w:t>
+        </w:r>
+      </w:ins>
+      <w:r>
+        <w:rPr>
+          <w:rFonts w:ascii="Times New Roman" w:hAnsi="Times New Roman" w:cs="Times New Roman"/>
+        </w:rPr>
+        <w:t xml:space="preserve">. </w:t>
+      </w:r>
+      <w:ins w:id="31" w:author="Sarah Payne (RIT Student)" w:date="2026-04-09T16:04:00Z" w16du:dateUtc="2026-04-09T20:04:00Z">
+        <w:r>
+          <w:rPr>
+            <w:rFonts w:ascii="Times New Roman" w:hAnsi="Times New Roman" w:cs="Times New Roman"/>
+          </w:rPr>
+          <w:t>We completed our research at the same time as we started on the development of the web game</w:t>
+        </w:r>
+      </w:ins>
+      <w:del w:id="32" w:author="Sarah Payne (RIT Student)" w:date="2026-04-09T16:05:00Z" w16du:dateUtc="2026-04-09T20:05:00Z">
+        <w:r>
+          <w:rPr>
+            <w:rFonts w:ascii="Times New Roman" w:hAnsi="Times New Roman" w:cs="Times New Roman"/>
+          </w:rPr>
+          <w:delText>This research was executed in parallel with the development of the interactive web game</w:delText>
+        </w:r>
+      </w:del>
+      <w:r>
+        <w:rPr>
+          <w:rFonts w:ascii="Times New Roman" w:hAnsi="Times New Roman" w:cs="Times New Roman"/>
+        </w:rPr>
+        <w:t xml:space="preserve"> to maximize efficiency. </w:t>
+      </w:r>
+      <w:ins w:id="33" w:author="Sarah Payne (RIT Student)" w:date="2026-04-09T16:05:00Z" w16du:dateUtc="2026-04-09T20:05:00Z">
+        <w:r>
+          <w:rPr>
+            <w:rFonts w:ascii="Times New Roman" w:hAnsi="Times New Roman" w:cs="Times New Roman"/>
+          </w:rPr>
+          <w:t xml:space="preserve">We then </w:t>
+        </w:r>
+      </w:ins>
+      <w:del w:id="34" w:author="Sarah Payne (RIT Student)" w:date="2026-04-09T16:05:00Z" w16du:dateUtc="2026-04-09T20:05:00Z">
+        <w:r>
+          <w:rPr>
+            <w:rFonts w:ascii="Times New Roman" w:hAnsi="Times New Roman" w:cs="Times New Roman"/>
+          </w:rPr>
+          <w:delText xml:space="preserve">Upon completion of research, the information was </w:delText>
+        </w:r>
+      </w:del>
+      <w:r>
+        <w:rPr>
+          <w:rFonts w:ascii="Times New Roman" w:hAnsi="Times New Roman" w:cs="Times New Roman"/>
+        </w:rPr>
+        <w:t xml:space="preserve">injected </w:t>
+      </w:r>
+      <w:ins w:id="35" w:author="Sarah Payne (RIT Student)" w:date="2026-04-09T16:05:00Z" w16du:dateUtc="2026-04-09T20:05:00Z">
+        <w:r>
+          <w:rPr>
+            <w:rFonts w:ascii="Times New Roman" w:hAnsi="Times New Roman" w:cs="Times New Roman"/>
+          </w:rPr>
+          <w:t xml:space="preserve">the information we found </w:t>
+        </w:r>
+      </w:ins>
+      <w:r>
+        <w:rPr>
+          <w:rFonts w:ascii="Times New Roman" w:hAnsi="Times New Roman" w:cs="Times New Roman"/>
+        </w:rPr>
+        <w:t xml:space="preserve">into the game to replace placeholder information. Chase </w:t>
+      </w:r>
+      <w:del w:id="36" w:author="Sarah Payne (RIT Student)" w:date="2026-04-09T16:05:00Z" w16du:dateUtc="2026-04-09T20:05:00Z">
+        <w:r>
+          <w:rPr>
+            <w:rFonts w:ascii="Times New Roman" w:hAnsi="Times New Roman" w:cs="Times New Roman"/>
+          </w:rPr>
+          <w:delText>handled the</w:delText>
+        </w:r>
+      </w:del>
+      <w:ins w:id="37" w:author="Sarah Payne (RIT Student)" w:date="2026-04-09T16:05:00Z" w16du:dateUtc="2026-04-09T20:05:00Z">
+        <w:r>
+          <w:rPr>
+            <w:rFonts w:ascii="Times New Roman" w:hAnsi="Times New Roman" w:cs="Times New Roman"/>
+          </w:rPr>
+          <w:t>was responsible for</w:t>
+        </w:r>
+      </w:ins>
+      <w:r>
+        <w:rPr>
+          <w:rFonts w:ascii="Times New Roman" w:hAnsi="Times New Roman" w:cs="Times New Roman"/>
+        </w:rPr>
+        <w:t xml:space="preserve"> polishing </w:t>
+      </w:r>
+      <w:del w:id="38" w:author="Sarah Payne (RIT Student)" w:date="2026-04-09T16:06:00Z" w16du:dateUtc="2026-04-09T20:06:00Z">
+        <w:r>
+          <w:rPr>
+            <w:rFonts w:ascii="Times New Roman" w:hAnsi="Times New Roman" w:cs="Times New Roman"/>
+          </w:rPr>
+          <w:delText>o</w:delText>
+        </w:r>
+      </w:del>
+      <w:del w:id="39" w:author="Sarah Payne (RIT Student)" w:date="2026-04-09T16:05:00Z" w16du:dateUtc="2026-04-09T20:05:00Z">
+        <w:r>
+          <w:rPr>
+            <w:rFonts w:ascii="Times New Roman" w:hAnsi="Times New Roman" w:cs="Times New Roman"/>
+          </w:rPr>
+          <w:delText xml:space="preserve">f </w:delText>
+        </w:r>
+      </w:del>
+      <w:r>
+        <w:rPr>
+          <w:rFonts w:ascii="Times New Roman" w:hAnsi="Times New Roman" w:cs="Times New Roman"/>
+        </w:rPr>
+        <w:t xml:space="preserve">the educational components, while Sarah handled the creation of the </w:t>
+      </w:r>
+      <w:ins w:id="40" w:author="Sarah Payne (RIT Student)" w:date="2026-04-09T16:06:00Z" w16du:dateUtc="2026-04-09T20:06:00Z">
+        <w:r>
+          <w:rPr>
+            <w:rFonts w:ascii="Times New Roman" w:hAnsi="Times New Roman" w:cs="Times New Roman"/>
+          </w:rPr>
+          <w:t>graphics and assets used in game.</w:t>
+        </w:r>
+      </w:ins>
+      <w:del w:id="41" w:author="Sarah Payne (RIT Student)" w:date="2026-04-09T16:06:00Z" w16du:dateUtc="2026-04-09T20:06:00Z">
+        <w:r>
+          <w:rPr>
+            <w:rFonts w:ascii="Times New Roman" w:hAnsi="Times New Roman" w:cs="Times New Roman"/>
+          </w:rPr>
+          <w:delText>different packing method</w:delText>
+        </w:r>
+        <w:r>
+          <w:rPr>
+            <w:rFonts w:ascii="Times New Roman" w:hAnsi="Times New Roman" w:cs="Times New Roman"/>
+          </w:rPr>
+          <w:delText>s</w:delText>
+        </w:r>
+        <w:r>
+          <w:rPr>
+            <w:rFonts w:ascii="Times New Roman" w:hAnsi="Times New Roman" w:cs="Times New Roman"/>
+          </w:rPr>
+          <w:delText xml:space="preserve"> graphics/assets. </w:delText>
+        </w:r>
+      </w:del>
     </w:p>
     <w:p>
       <w:pPr>
@@ -194,37 +637,180 @@
           <w:rFonts w:ascii="Times New Roman" w:hAnsi="Times New Roman" w:cs="Times New Roman"/>
         </w:rPr>
       </w:pPr>
-      <w:r>
-        <w:rPr>
-          <w:rFonts w:ascii="Times New Roman" w:hAnsi="Times New Roman" w:cs="Times New Roman"/>
-        </w:rPr>
-        <w:lastRenderedPageBreak/>
-        <w:t>The team worked together to perform research, synthesizing data from peer-reviewed research, industry data, and lifecycle assessments</w:t>
-      </w:r>
-      <w:r>
-        <w:rPr>
-          <w:rFonts w:ascii="Times New Roman" w:hAnsi="Times New Roman" w:cs="Times New Roman"/>
-        </w:rPr>
-        <w:t>. This research was executed in parallel with the development of the interactive web game</w:t>
-      </w:r>
-      <w:r>
-        <w:rPr>
-          <w:rFonts w:ascii="Times New Roman" w:hAnsi="Times New Roman" w:cs="Times New Roman"/>
-        </w:rPr>
-        <w:t xml:space="preserve"> to maximize efficiency. Upon completion of research, the information was injected into the game to replace placeholder information. Chase handled the polishing of the educational components, while Sarah handled the creation of the different packing method</w:t>
-      </w:r>
-      <w:r>
-        <w:rPr>
-          <w:rFonts w:ascii="Times New Roman" w:hAnsi="Times New Roman" w:cs="Times New Roman"/>
-        </w:rPr>
-        <w:t>s</w:t>
-      </w:r>
-      <w:r>
-        <w:rPr>
-          <w:rFonts w:ascii="Times New Roman" w:hAnsi="Times New Roman" w:cs="Times New Roman"/>
-        </w:rPr>
-        <w:t xml:space="preserve"> graphics/assets. </w:t>
-      </w:r>
+      <w:del w:id="42" w:author="Sarah Payne (RIT Student)" w:date="2026-04-09T16:06:00Z" w16du:dateUtc="2026-04-09T20:06:00Z">
+        <w:r>
+          <w:rPr>
+            <w:rFonts w:ascii="Times New Roman" w:hAnsi="Times New Roman" w:cs="Times New Roman"/>
+          </w:rPr>
+          <w:delText>During the creation of this wines of the world project</w:delText>
+        </w:r>
+      </w:del>
+      <w:ins w:id="43" w:author="Sarah Payne (RIT Student)" w:date="2026-04-09T16:06:00Z" w16du:dateUtc="2026-04-09T20:06:00Z">
+        <w:r>
+          <w:rPr>
+            <w:rFonts w:ascii="Times New Roman" w:hAnsi="Times New Roman" w:cs="Times New Roman"/>
+          </w:rPr>
+          <w:t>As we researched</w:t>
+        </w:r>
+      </w:ins>
+      <w:r>
+        <w:rPr>
+          <w:rFonts w:ascii="Times New Roman" w:hAnsi="Times New Roman" w:cs="Times New Roman"/>
+        </w:rPr>
+        <w:t xml:space="preserve">, we learned about </w:t>
+      </w:r>
+      <w:del w:id="44" w:author="Sarah Payne (RIT Student)" w:date="2026-04-09T16:06:00Z" w16du:dateUtc="2026-04-09T20:06:00Z">
+        <w:r>
+          <w:rPr>
+            <w:rFonts w:ascii="Times New Roman" w:hAnsi="Times New Roman" w:cs="Times New Roman"/>
+          </w:rPr>
+          <w:delText>the landscape</w:delText>
+        </w:r>
+      </w:del>
+      <w:ins w:id="45" w:author="Sarah Payne (RIT Student)" w:date="2026-04-09T16:06:00Z" w16du:dateUtc="2026-04-09T20:06:00Z">
+        <w:r>
+          <w:rPr>
+            <w:rFonts w:ascii="Times New Roman" w:hAnsi="Times New Roman" w:cs="Times New Roman"/>
+          </w:rPr>
+          <w:t>several different ki</w:t>
+        </w:r>
+      </w:ins>
+      <w:ins w:id="46" w:author="Sarah Payne (RIT Student)" w:date="2026-04-09T16:07:00Z" w16du:dateUtc="2026-04-09T20:07:00Z">
+        <w:r>
+          <w:rPr>
+            <w:rFonts w:ascii="Times New Roman" w:hAnsi="Times New Roman" w:cs="Times New Roman"/>
+          </w:rPr>
+          <w:t>nds</w:t>
+        </w:r>
+      </w:ins>
+      <w:r>
+        <w:rPr>
+          <w:rFonts w:ascii="Times New Roman" w:hAnsi="Times New Roman" w:cs="Times New Roman"/>
+        </w:rPr>
+        <w:t xml:space="preserve"> of wine packaging methods. </w:t>
+      </w:r>
+      <w:del w:id="47" w:author="Sarah Payne (RIT Student)" w:date="2026-04-09T16:07:00Z" w16du:dateUtc="2026-04-09T20:07:00Z">
+        <w:r>
+          <w:rPr>
+            <w:rFonts w:ascii="Times New Roman" w:hAnsi="Times New Roman" w:cs="Times New Roman"/>
+          </w:rPr>
+          <w:delText>At a high level,</w:delText>
+        </w:r>
+      </w:del>
+      <w:ins w:id="48" w:author="Sarah Payne (RIT Student)" w:date="2026-04-09T16:07:00Z" w16du:dateUtc="2026-04-09T20:07:00Z">
+        <w:r>
+          <w:rPr>
+            <w:rFonts w:ascii="Times New Roman" w:hAnsi="Times New Roman" w:cs="Times New Roman"/>
+          </w:rPr>
+          <w:t>T</w:t>
+        </w:r>
+      </w:ins>
+      <w:del w:id="49" w:author="Sarah Payne (RIT Student)" w:date="2026-04-09T16:07:00Z" w16du:dateUtc="2026-04-09T20:07:00Z">
+        <w:r>
+          <w:rPr>
+            <w:rFonts w:ascii="Times New Roman" w:hAnsi="Times New Roman" w:cs="Times New Roman"/>
+          </w:rPr>
+          <w:delText xml:space="preserve"> t</w:delText>
+        </w:r>
+      </w:del>
+      <w:r>
+        <w:rPr>
+          <w:rFonts w:ascii="Times New Roman" w:hAnsi="Times New Roman" w:cs="Times New Roman"/>
+        </w:rPr>
+        <w:t xml:space="preserve">he central finding </w:t>
+      </w:r>
+      <w:del w:id="50" w:author="Sarah Payne (RIT Student)" w:date="2026-04-09T16:07:00Z" w16du:dateUtc="2026-04-09T20:07:00Z">
+        <w:r>
+          <w:rPr>
+            <w:rFonts w:ascii="Times New Roman" w:hAnsi="Times New Roman" w:cs="Times New Roman"/>
+          </w:rPr>
+          <w:delText xml:space="preserve">of our research </w:delText>
+        </w:r>
+      </w:del>
+      <w:r>
+        <w:rPr>
+          <w:rFonts w:ascii="Times New Roman" w:hAnsi="Times New Roman" w:cs="Times New Roman"/>
+        </w:rPr>
+        <w:t xml:space="preserve">was that there is no single, dominant packaging solution that optimally serves all situations. Packing methods balance tradeoffs </w:t>
+      </w:r>
+      <w:del w:id="51" w:author="Sarah Payne (RIT Student)" w:date="2026-04-09T16:07:00Z" w16du:dateUtc="2026-04-09T20:07:00Z">
+        <w:r>
+          <w:rPr>
+            <w:rFonts w:ascii="Times New Roman" w:hAnsi="Times New Roman" w:cs="Times New Roman"/>
+          </w:rPr>
+          <w:delText xml:space="preserve">among </w:delText>
+        </w:r>
+      </w:del>
+      <w:ins w:id="52" w:author="Sarah Payne (RIT Student)" w:date="2026-04-09T16:07:00Z" w16du:dateUtc="2026-04-09T20:07:00Z">
+        <w:r>
+          <w:rPr>
+            <w:rFonts w:ascii="Times New Roman" w:hAnsi="Times New Roman" w:cs="Times New Roman"/>
+          </w:rPr>
+          <w:t>between</w:t>
+        </w:r>
+        <w:r>
+          <w:rPr>
+            <w:rFonts w:ascii="Times New Roman" w:hAnsi="Times New Roman" w:cs="Times New Roman"/>
+          </w:rPr>
+          <w:t xml:space="preserve"> </w:t>
+        </w:r>
+      </w:ins>
+      <w:r>
+        <w:rPr>
+          <w:rFonts w:ascii="Times New Roman" w:hAnsi="Times New Roman" w:cs="Times New Roman"/>
+        </w:rPr>
+        <w:t xml:space="preserve">preservability, cost, sustainability, sensory impact, and aging potential. </w:t>
+      </w:r>
+      <w:ins w:id="53" w:author="Sarah Payne (RIT Student)" w:date="2026-04-09T16:07:00Z" w16du:dateUtc="2026-04-09T20:07:00Z">
+        <w:r>
+          <w:rPr>
+            <w:rFonts w:ascii="Times New Roman" w:hAnsi="Times New Roman" w:cs="Times New Roman"/>
+          </w:rPr>
+          <w:t xml:space="preserve">We also found some gaps in the research, </w:t>
+        </w:r>
+      </w:ins>
+      <w:ins w:id="54" w:author="Sarah Payne (RIT Student)" w:date="2026-04-09T16:08:00Z" w16du:dateUtc="2026-04-09T20:08:00Z">
+        <w:r>
+          <w:rPr>
+            <w:rFonts w:ascii="Times New Roman" w:hAnsi="Times New Roman" w:cs="Times New Roman"/>
+          </w:rPr>
+          <w:t xml:space="preserve">there was not much detail to be found on long term aging, </w:t>
+        </w:r>
+        <w:r>
+          <w:rPr>
+            <w:rFonts w:ascii="Times New Roman" w:hAnsi="Times New Roman" w:cs="Times New Roman"/>
+          </w:rPr>
+          <w:t xml:space="preserve">the effects of microplastics, or how the packaging </w:t>
+        </w:r>
+        <w:proofErr w:type="gramStart"/>
+        <w:r>
+          <w:rPr>
+            <w:rFonts w:ascii="Times New Roman" w:hAnsi="Times New Roman" w:cs="Times New Roman"/>
+          </w:rPr>
+          <w:t>affects</w:t>
+        </w:r>
+        <w:proofErr w:type="gramEnd"/>
+        <w:r>
+          <w:rPr>
+            <w:rFonts w:ascii="Times New Roman" w:hAnsi="Times New Roman" w:cs="Times New Roman"/>
+          </w:rPr>
+          <w:t xml:space="preserve"> consumer perception of the product. </w:t>
+        </w:r>
+      </w:ins>
+      <w:del w:id="55" w:author="Sarah Payne (RIT Student)" w:date="2026-04-09T16:08:00Z" w16du:dateUtc="2026-04-09T20:08:00Z">
+        <w:r>
+          <w:rPr>
+            <w:rFonts w:ascii="Times New Roman" w:hAnsi="Times New Roman" w:cs="Times New Roman"/>
+          </w:rPr>
+          <w:delText xml:space="preserve">There were present research gaps – particularly regarding long term aging, microplastic release, and consumer perception. </w:delText>
+        </w:r>
+        <w:r>
+          <w:rPr>
+            <w:rFonts w:ascii="Times New Roman" w:hAnsi="Times New Roman" w:cs="Times New Roman"/>
+          </w:rPr>
+          <w:delText xml:space="preserve">Our key findings follow. </w:delText>
+        </w:r>
+      </w:del>
     </w:p>
     <w:p>
       <w:pPr>
@@ -238,14 +824,167 @@
         <w:rPr>
           <w:rFonts w:ascii="Times New Roman" w:hAnsi="Times New Roman" w:cs="Times New Roman"/>
         </w:rPr>
-        <w:t xml:space="preserve">During the creation of this wines of the world project, we learned about the landscape of wine packaging methods. At a high level, the central finding of our research was that there is no single, dominant packaging solution that optimally serves all situations. Packing methods balance tradeoffs among preservability, cost, sustainability, sensory impact, and aging potential. There were present research gaps – particularly regarding long term aging, microplastic release, and consumer perception. </w:t>
-      </w:r>
-      <w:r>
-        <w:rPr>
-          <w:rFonts w:ascii="Times New Roman" w:hAnsi="Times New Roman" w:cs="Times New Roman"/>
-        </w:rPr>
-        <w:t xml:space="preserve">Our key findings follow. </w:t>
-      </w:r>
+        <w:t xml:space="preserve">Natural cork remains the preferred closure for wines intended for aging, supported by </w:t>
+      </w:r>
+      <w:proofErr w:type="spellStart"/>
+      <w:proofErr w:type="gramStart"/>
+      <w:r>
+        <w:rPr>
+          <w:rFonts w:ascii="Times New Roman" w:hAnsi="Times New Roman" w:cs="Times New Roman"/>
+        </w:rPr>
+        <w:t>it</w:t>
+      </w:r>
+      <w:ins w:id="56" w:author="Sarah Payne (RIT Student)" w:date="2026-04-09T16:09:00Z" w16du:dateUtc="2026-04-09T20:09:00Z">
+        <w:r>
+          <w:rPr>
+            <w:rFonts w:ascii="Times New Roman" w:hAnsi="Times New Roman" w:cs="Times New Roman"/>
+          </w:rPr>
+          <w:t>’</w:t>
+        </w:r>
+      </w:ins>
+      <w:r>
+        <w:rPr>
+          <w:rFonts w:ascii="Times New Roman" w:hAnsi="Times New Roman" w:cs="Times New Roman"/>
+        </w:rPr>
+        <w:t>s</w:t>
+      </w:r>
+      <w:proofErr w:type="spellEnd"/>
+      <w:r>
+        <w:rPr>
+          <w:rFonts w:ascii="Times New Roman" w:hAnsi="Times New Roman" w:cs="Times New Roman"/>
+        </w:rPr>
+        <w:t xml:space="preserve"> established</w:t>
+      </w:r>
+      <w:proofErr w:type="gramEnd"/>
+      <w:r>
+        <w:rPr>
+          <w:rFonts w:ascii="Times New Roman" w:hAnsi="Times New Roman" w:cs="Times New Roman"/>
+        </w:rPr>
+        <w:t xml:space="preserve"> track record across decades of cellaring. However, cork presents ongoing challenges. Its oxygen transmission rate variability is wide, ranging from 0.5 to 10 </w:t>
+      </w:r>
+      <w:proofErr w:type="spellStart"/>
+      <w:r>
+        <w:rPr>
+          <w:rFonts w:ascii="Times New Roman" w:hAnsi="Times New Roman" w:cs="Times New Roman"/>
+        </w:rPr>
+        <w:t>μg</w:t>
+      </w:r>
+      <w:proofErr w:type="spellEnd"/>
+      <w:r>
+        <w:rPr>
+          <w:rFonts w:ascii="Times New Roman" w:hAnsi="Times New Roman" w:cs="Times New Roman"/>
+        </w:rPr>
+        <w:t xml:space="preserve"> O₂/day, </w:t>
+      </w:r>
+      <w:ins w:id="57" w:author="Sarah Payne (RIT Student)" w:date="2026-04-09T16:10:00Z" w16du:dateUtc="2026-04-09T20:10:00Z">
+        <w:r>
+          <w:rPr>
+            <w:rFonts w:ascii="Times New Roman" w:hAnsi="Times New Roman" w:cs="Times New Roman"/>
+          </w:rPr>
+          <w:t xml:space="preserve">this means that the amount of </w:t>
+        </w:r>
+      </w:ins>
+      <w:ins w:id="58" w:author="Sarah Payne (RIT Student)" w:date="2026-04-09T16:11:00Z" w16du:dateUtc="2026-04-09T20:11:00Z">
+        <w:r>
+          <w:rPr>
+            <w:rFonts w:ascii="Times New Roman" w:hAnsi="Times New Roman" w:cs="Times New Roman"/>
+          </w:rPr>
+          <w:t xml:space="preserve">oxygen that enters the bottle over time can be inconsistent, leading to variation </w:t>
+        </w:r>
+      </w:ins>
+      <w:ins w:id="59" w:author="Sarah Payne (RIT Student)" w:date="2026-04-09T16:12:00Z" w16du:dateUtc="2026-04-09T20:12:00Z">
+        <w:r>
+          <w:rPr>
+            <w:rFonts w:ascii="Times New Roman" w:hAnsi="Times New Roman" w:cs="Times New Roman"/>
+          </w:rPr>
+          <w:t xml:space="preserve">in </w:t>
+        </w:r>
+        <w:r>
+          <w:rPr>
+            <w:rFonts w:ascii="Times New Roman" w:hAnsi="Times New Roman" w:cs="Times New Roman"/>
+          </w:rPr>
+          <w:lastRenderedPageBreak/>
+          <w:t xml:space="preserve">wine </w:t>
+        </w:r>
+      </w:ins>
+      <w:ins w:id="60" w:author="Sarah Payne (RIT Student)" w:date="2026-04-09T16:11:00Z" w16du:dateUtc="2026-04-09T20:11:00Z">
+        <w:r>
+          <w:rPr>
+            <w:rFonts w:ascii="Times New Roman" w:hAnsi="Times New Roman" w:cs="Times New Roman"/>
+          </w:rPr>
+          <w:t>among bottles fr</w:t>
+        </w:r>
+      </w:ins>
+      <w:ins w:id="61" w:author="Sarah Payne (RIT Student)" w:date="2026-04-09T16:12:00Z" w16du:dateUtc="2026-04-09T20:12:00Z">
+        <w:r>
+          <w:rPr>
+            <w:rFonts w:ascii="Times New Roman" w:hAnsi="Times New Roman" w:cs="Times New Roman"/>
+          </w:rPr>
+          <w:t xml:space="preserve">om the same batch as each cork allows more or less oxygen into the bottle. </w:t>
+        </w:r>
+      </w:ins>
+      <w:ins w:id="62" w:author="Sarah Payne (RIT Student)" w:date="2026-04-09T16:13:00Z" w16du:dateUtc="2026-04-09T20:13:00Z">
+        <w:r>
+          <w:rPr>
+            <w:rFonts w:ascii="Times New Roman" w:hAnsi="Times New Roman" w:cs="Times New Roman"/>
+          </w:rPr>
+          <w:t xml:space="preserve">Additionally, </w:t>
+        </w:r>
+      </w:ins>
+      <w:del w:id="63" w:author="Sarah Payne (RIT Student)" w:date="2026-04-09T16:13:00Z" w16du:dateUtc="2026-04-09T20:13:00Z">
+        <w:r>
+          <w:rPr>
+            <w:rFonts w:ascii="Times New Roman" w:hAnsi="Times New Roman" w:cs="Times New Roman"/>
+          </w:rPr>
+          <w:delText xml:space="preserve">and </w:delText>
+        </w:r>
+      </w:del>
+      <w:r>
+        <w:rPr>
+          <w:rFonts w:ascii="Times New Roman" w:hAnsi="Times New Roman" w:cs="Times New Roman"/>
+        </w:rPr>
+        <w:t>TCA contamination</w:t>
+      </w:r>
+      <w:ins w:id="64" w:author="Sarah Payne (RIT Student)" w:date="2026-04-09T16:16:00Z" w16du:dateUtc="2026-04-09T20:16:00Z">
+        <w:r>
+          <w:rPr>
+            <w:rFonts w:ascii="Times New Roman" w:hAnsi="Times New Roman" w:cs="Times New Roman"/>
+          </w:rPr>
+          <w:t xml:space="preserve"> rates are ~1-3%, also known as ‘cork taint’ this is a fault caused when fungi in the cork interact with cleaning compou</w:t>
+        </w:r>
+      </w:ins>
+      <w:ins w:id="65" w:author="Sarah Payne (RIT Student)" w:date="2026-04-09T16:17:00Z" w16du:dateUtc="2026-04-09T20:17:00Z">
+        <w:r>
+          <w:rPr>
+            <w:rFonts w:ascii="Times New Roman" w:hAnsi="Times New Roman" w:cs="Times New Roman"/>
+          </w:rPr>
+          <w:t>nds and will ruin the bottle of wine.</w:t>
+        </w:r>
+      </w:ins>
+      <w:del w:id="66" w:author="Sarah Payne (RIT Student)" w:date="2026-04-09T16:15:00Z" w16du:dateUtc="2026-04-09T20:15:00Z">
+        <w:r>
+          <w:rPr>
+            <w:rFonts w:ascii="Times New Roman" w:hAnsi="Times New Roman" w:cs="Times New Roman"/>
+          </w:rPr>
+          <w:delText xml:space="preserve"> rates persist at approximately 1–3%</w:delText>
+        </w:r>
+      </w:del>
+      <w:del w:id="67" w:author="Sarah Payne (RIT Student)" w:date="2026-04-09T16:13:00Z" w16du:dateUtc="2026-04-09T20:13:00Z">
+        <w:r>
+          <w:rPr>
+            <w:rFonts w:ascii="Times New Roman" w:hAnsi="Times New Roman" w:cs="Times New Roman"/>
+          </w:rPr>
+          <w:delText>.</w:delText>
+        </w:r>
+      </w:del>
+      <w:ins w:id="68" w:author="Sarah Payne (RIT Student)" w:date="2026-04-09T16:18:00Z" w16du:dateUtc="2026-04-09T20:18:00Z">
+        <w:r>
+          <w:rPr>
+            <w:rFonts w:ascii="Times New Roman" w:hAnsi="Times New Roman" w:cs="Times New Roman"/>
+          </w:rPr>
+          <w:t xml:space="preserve"> </w:t>
+        </w:r>
+      </w:ins>
     </w:p>
     <w:p>
       <w:pPr>
@@ -259,7 +998,49 @@
         <w:rPr>
           <w:rFonts w:ascii="Times New Roman" w:hAnsi="Times New Roman" w:cs="Times New Roman"/>
         </w:rPr>
-        <w:t>Natural cork remains the preferred closure for wines intended for aging, supported by its established track record across decades of cellaring. However, cork presents ongoing challenges. Its oxygen transmission rate variability is wide, ranging from 0.5 to 10 μg O₂/day, and TCA contamination rates persist at approximately 1–3%.</w:t>
+        <w:t xml:space="preserve">Screw caps equipped with Saran-tin or </w:t>
+      </w:r>
+      <w:proofErr w:type="spellStart"/>
+      <w:r>
+        <w:rPr>
+          <w:rFonts w:ascii="Times New Roman" w:hAnsi="Times New Roman" w:cs="Times New Roman"/>
+        </w:rPr>
+        <w:t>Saranex</w:t>
+      </w:r>
+      <w:proofErr w:type="spellEnd"/>
+      <w:r>
+        <w:rPr>
+          <w:rFonts w:ascii="Times New Roman" w:hAnsi="Times New Roman" w:cs="Times New Roman"/>
+        </w:rPr>
+        <w:t xml:space="preserve"> liners offer the most consistent oxygen transmission rates, between 0.05 and 0.3 </w:t>
+      </w:r>
+      <w:proofErr w:type="spellStart"/>
+      <w:r>
+        <w:rPr>
+          <w:rFonts w:ascii="Times New Roman" w:hAnsi="Times New Roman" w:cs="Times New Roman"/>
+        </w:rPr>
+        <w:t>μg</w:t>
+      </w:r>
+      <w:proofErr w:type="spellEnd"/>
+      <w:r>
+        <w:rPr>
+          <w:rFonts w:ascii="Times New Roman" w:hAnsi="Times New Roman" w:cs="Times New Roman"/>
+        </w:rPr>
+        <w:t xml:space="preserve"> O₂/day, with batch-to-batch variation rarely exceeding ±10%. This consistency has made screw caps increasingly favored for aromatic white wines and </w:t>
+      </w:r>
+      <w:proofErr w:type="gramStart"/>
+      <w:r>
+        <w:rPr>
+          <w:rFonts w:ascii="Times New Roman" w:hAnsi="Times New Roman" w:cs="Times New Roman"/>
+        </w:rPr>
+        <w:t>early-drinking</w:t>
+      </w:r>
+      <w:proofErr w:type="gramEnd"/>
+      <w:r>
+        <w:rPr>
+          <w:rFonts w:ascii="Times New Roman" w:hAnsi="Times New Roman" w:cs="Times New Roman"/>
+        </w:rPr>
+        <w:t xml:space="preserve"> styles. Technical closures such as Diam have seen rapid expansion by providing TCA-free performance with controlled oxygen ingress.</w:t>
       </w:r>
     </w:p>
     <w:p>
@@ -274,7 +1055,7 @@
         <w:rPr>
           <w:rFonts w:ascii="Times New Roman" w:hAnsi="Times New Roman" w:cs="Times New Roman"/>
         </w:rPr>
-        <w:t>Screw caps equipped with Saran-tin or Saranex liners offer the most consistent oxygen transmission rates, between 0.05 and 0.3 μg O₂/day, with batch-to-batch variation rarely exceeding ±10%. This consistency has made screw caps increasingly favored for aromatic white wines and early-drinking styles. Technical closures such as Diam have seen rapid expansion by providing TCA-free performance with controlled oxygen ingress.</w:t>
+        <w:t>Bag-in-box and canned wine formats deliver substantial environmental benefits, with carbon footprints 35–84% lower than traditional glass bottles. Despite these advantages, both formats face limitations in shelf life and consumer perception.</w:t>
       </w:r>
     </w:p>
     <w:p>
@@ -289,8 +1070,67 @@
         <w:rPr>
           <w:rFonts w:ascii="Times New Roman" w:hAnsi="Times New Roman" w:cs="Times New Roman"/>
         </w:rPr>
-        <w:lastRenderedPageBreak/>
-        <w:t>Bag-in-box and canned wine formats deliver substantial environmental benefits, with carbon footprints 35–84% lower than traditional glass bottles. Despite these advantages, both formats face limitations in shelf life and consumer perception.</w:t>
+        <w:t>Emerging innovations signal a forward-looking trajectory for the packaging landscape. NFC/RFID-enabled smart closures, biodegradable plant-based stoppers, and flat-bottle PET formats point toward packaging that integrates digital traceability, sustainability, and precision oxygen management. However, significant research gaps persist</w:t>
+      </w:r>
+      <w:ins w:id="69" w:author="Sarah Payne (RIT Student)" w:date="2026-04-09T16:20:00Z" w16du:dateUtc="2026-04-09T20:20:00Z">
+        <w:r>
+          <w:rPr>
+            <w:rFonts w:ascii="Times New Roman" w:hAnsi="Times New Roman" w:cs="Times New Roman"/>
+          </w:rPr>
+          <w:t xml:space="preserve">, </w:t>
+        </w:r>
+      </w:ins>
+      <w:del w:id="70" w:author="Sarah Payne (RIT Student)" w:date="2026-04-09T16:20:00Z" w16du:dateUtc="2026-04-09T20:20:00Z">
+        <w:r>
+          <w:rPr>
+            <w:rFonts w:ascii="Times New Roman" w:hAnsi="Times New Roman" w:cs="Times New Roman"/>
+          </w:rPr>
+          <w:delText>. L</w:delText>
+        </w:r>
+      </w:del>
+      <w:proofErr w:type="spellStart"/>
+      <w:r>
+        <w:rPr>
+          <w:rFonts w:ascii="Times New Roman" w:hAnsi="Times New Roman" w:cs="Times New Roman"/>
+        </w:rPr>
+        <w:t>ong</w:t>
+      </w:r>
+      <w:proofErr w:type="spellEnd"/>
+      <w:r>
+        <w:rPr>
+          <w:rFonts w:ascii="Times New Roman" w:hAnsi="Times New Roman" w:cs="Times New Roman"/>
+        </w:rPr>
+        <w:t xml:space="preserve">-term aging studies </w:t>
+      </w:r>
+      <w:proofErr w:type="spellStart"/>
+      <w:ins w:id="71" w:author="Sarah Payne (RIT Student)" w:date="2026-04-09T16:20:00Z" w16du:dateUtc="2026-04-09T20:20:00Z">
+        <w:r>
+          <w:rPr>
+            <w:rFonts w:ascii="Times New Roman" w:hAnsi="Times New Roman" w:cs="Times New Roman"/>
+          </w:rPr>
+          <w:t>of</w:t>
+        </w:r>
+      </w:ins>
+      <w:del w:id="72" w:author="Sarah Payne (RIT Student)" w:date="2026-04-09T16:20:00Z" w16du:dateUtc="2026-04-09T20:20:00Z">
+        <w:r>
+          <w:rPr>
+            <w:rFonts w:ascii="Times New Roman" w:hAnsi="Times New Roman" w:cs="Times New Roman"/>
+          </w:rPr>
+          <w:delText xml:space="preserve">under </w:delText>
+        </w:r>
+      </w:del>
+      <w:r>
+        <w:rPr>
+          <w:rFonts w:ascii="Times New Roman" w:hAnsi="Times New Roman" w:cs="Times New Roman"/>
+        </w:rPr>
+        <w:t>alternative</w:t>
+      </w:r>
+      <w:proofErr w:type="spellEnd"/>
+      <w:r>
+        <w:rPr>
+          <w:rFonts w:ascii="Times New Roman" w:hAnsi="Times New Roman" w:cs="Times New Roman"/>
+        </w:rPr>
+        <w:t xml:space="preserve"> closures exceeding fifteen years remain limited. Questions surrounding microplastic leaching from synthetic materials and the full lifecycle impacts of novel packaging formats have yet to be thoroughly addressed.</w:t>
       </w:r>
     </w:p>
     <w:p>
@@ -305,22 +1145,42 @@
         <w:rPr>
           <w:rFonts w:ascii="Times New Roman" w:hAnsi="Times New Roman" w:cs="Times New Roman"/>
         </w:rPr>
-        <w:t>Emerging innovations signal a forward-looking trajectory for the packaging landscape. NFC/RFID-enabled smart closures, biodegradable plant-based stoppers, and flat-bottle PET formats point toward packaging that integrates digital traceability, sustainability, and precision oxygen management. However, significant research gaps persist. Long-term aging studies under alternative closures exceeding fifteen years remain limited. Questions surrounding microplastic leaching from synthetic materials and the full lifecycle impacts of novel packaging formats have yet to be thoroughly addressed.</w:t>
-      </w:r>
-    </w:p>
-    <w:p>
-      <w:pPr>
-        <w:spacing w:line="480" w:lineRule="auto"/>
-        <w:ind w:firstLine="720"/>
-        <w:rPr>
-          <w:rFonts w:ascii="Times New Roman" w:hAnsi="Times New Roman" w:cs="Times New Roman"/>
-        </w:rPr>
-      </w:pPr>
-      <w:r>
-        <w:rPr>
-          <w:rFonts w:ascii="Times New Roman" w:hAnsi="Times New Roman" w:cs="Times New Roman"/>
-        </w:rPr>
-        <w:t xml:space="preserve">Overall, this was an enjoyable and educational project we were happy to work on. We enjoyed the opportunity to explore a component of the wine industry in more depth. This research will inform our own future wine purchases. We may favor the natural cork for more expensive, vintaged wines. But we will not discount the advantages of the other methods, especially when that wine is planned to be purchased and consumed in a relatively short window. We may elect to support the more environmentally friendly methods in these situations, to encourage their growth and future improvements to their technology.  </w:t>
+        <w:t xml:space="preserve">Overall, this was an enjoyable and educational project we were happy to work on. We enjoyed the opportunity to explore a component of the wine industry in more depth. This research will inform </w:t>
+      </w:r>
+      <w:proofErr w:type="gramStart"/>
+      <w:r>
+        <w:rPr>
+          <w:rFonts w:ascii="Times New Roman" w:hAnsi="Times New Roman" w:cs="Times New Roman"/>
+        </w:rPr>
+        <w:t>our</w:t>
+      </w:r>
+      <w:proofErr w:type="gramEnd"/>
+      <w:r>
+        <w:rPr>
+          <w:rFonts w:ascii="Times New Roman" w:hAnsi="Times New Roman" w:cs="Times New Roman"/>
+        </w:rPr>
+        <w:t xml:space="preserve"> own future wine purchases. We may favor the natural cork for more </w:t>
+      </w:r>
+      <w:r>
+        <w:rPr>
+          <w:rFonts w:ascii="Times New Roman" w:hAnsi="Times New Roman" w:cs="Times New Roman"/>
+        </w:rPr>
+        <w:lastRenderedPageBreak/>
+        <w:t xml:space="preserve">expensive, </w:t>
+      </w:r>
+      <w:proofErr w:type="spellStart"/>
+      <w:r>
+        <w:rPr>
+          <w:rFonts w:ascii="Times New Roman" w:hAnsi="Times New Roman" w:cs="Times New Roman"/>
+        </w:rPr>
+        <w:t>vintaged</w:t>
+      </w:r>
+      <w:proofErr w:type="spellEnd"/>
+      <w:r>
+        <w:rPr>
+          <w:rFonts w:ascii="Times New Roman" w:hAnsi="Times New Roman" w:cs="Times New Roman"/>
+        </w:rPr>
+        <w:t xml:space="preserve"> wines. But we will not discount the advantages of the other methods, especially when that wine is planned to be purchased and consumed in a relatively short window. We may elect to support the more environmentally friendly methods in these situations, to encourage their growth and future improvements to their technology.  </w:t>
       </w:r>
     </w:p>
     <w:p>
@@ -430,11 +1290,19 @@
           <w:szCs w:val="32"/>
         </w:rPr>
       </w:pPr>
-      <w:r>
-        <w:rPr>
-          <w:rFonts w:ascii="Times New Roman" w:hAnsi="Times New Roman" w:cs="Times New Roman"/>
-        </w:rPr>
-        <w:t>Skouroumounis, George, et al. “A Wine Bottle Closure Trial: The Effect of Closure Type on Wine Composition after 5 Years.” Australian Wine Research Institute, Technical Report, 2005.</w:t>
+      <w:proofErr w:type="spellStart"/>
+      <w:r>
+        <w:rPr>
+          <w:rFonts w:ascii="Times New Roman" w:hAnsi="Times New Roman" w:cs="Times New Roman"/>
+        </w:rPr>
+        <w:t>Skouroumounis</w:t>
+      </w:r>
+      <w:proofErr w:type="spellEnd"/>
+      <w:r>
+        <w:rPr>
+          <w:rFonts w:ascii="Times New Roman" w:hAnsi="Times New Roman" w:cs="Times New Roman"/>
+        </w:rPr>
+        <w:t>, George, et al. “A Wine Bottle Closure Trial: The Effect of Closure Type on Wine Composition after 5 Years.” Australian Wine Research Institute, Technical Report, 2005.</w:t>
       </w:r>
     </w:p>
     <w:p>
@@ -468,7 +1336,21 @@
         <w:rPr>
           <w:rFonts w:ascii="Times New Roman" w:hAnsi="Times New Roman" w:cs="Times New Roman"/>
         </w:rPr>
-        <w:t>Sullivan, Sean P. “How Big of an Issue Is Cork Taint, Really?” Northwest Wine Report, 25 Feb. 2023.</w:t>
+        <w:t xml:space="preserve">Sullivan, Sean P. “How Big of an Issue Is Cork Taint, </w:t>
+      </w:r>
+      <w:proofErr w:type="gramStart"/>
+      <w:r>
+        <w:rPr>
+          <w:rFonts w:ascii="Times New Roman" w:hAnsi="Times New Roman" w:cs="Times New Roman"/>
+        </w:rPr>
+        <w:t>Really</w:t>
+      </w:r>
+      <w:proofErr w:type="gramEnd"/>
+      <w:r>
+        <w:rPr>
+          <w:rFonts w:ascii="Times New Roman" w:hAnsi="Times New Roman" w:cs="Times New Roman"/>
+        </w:rPr>
+        <w:t>?” Northwest Wine Report, 25 Feb. 2023.</w:t>
       </w:r>
     </w:p>
     <w:p>
@@ -656,7 +1538,21 @@
         <w:rPr>
           <w:rFonts w:ascii="Times New Roman" w:hAnsi="Times New Roman" w:cs="Times New Roman"/>
         </w:rPr>
-        <w:t>International Organisation of Vine and Wine (OIV). “State of the World Vine and Wine Sector.” OIV Annual Reports, multiple years.</w:t>
+        <w:t xml:space="preserve">International </w:t>
+      </w:r>
+      <w:proofErr w:type="spellStart"/>
+      <w:r>
+        <w:rPr>
+          <w:rFonts w:ascii="Times New Roman" w:hAnsi="Times New Roman" w:cs="Times New Roman"/>
+        </w:rPr>
+        <w:t>Organisation</w:t>
+      </w:r>
+      <w:proofErr w:type="spellEnd"/>
+      <w:r>
+        <w:rPr>
+          <w:rFonts w:ascii="Times New Roman" w:hAnsi="Times New Roman" w:cs="Times New Roman"/>
+        </w:rPr>
+        <w:t xml:space="preserve"> of Vine and Wine (OIV). “State of the World Vine and Wine Sector.” OIV Annual Reports, multiple years.</w:t>
       </w:r>
     </w:p>
     <w:p>
@@ -703,11 +1599,19 @@
           <w:szCs w:val="32"/>
         </w:rPr>
       </w:pPr>
-      <w:r>
-        <w:rPr>
-          <w:rFonts w:ascii="Times New Roman" w:hAnsi="Times New Roman" w:cs="Times New Roman"/>
-        </w:rPr>
-        <w:t>Frugalpac / Intertek. “Lifecycle Assessment of the Frugal Bottle.” Independent Report, 2019.</w:t>
+      <w:proofErr w:type="spellStart"/>
+      <w:r>
+        <w:rPr>
+          <w:rFonts w:ascii="Times New Roman" w:hAnsi="Times New Roman" w:cs="Times New Roman"/>
+        </w:rPr>
+        <w:t>Frugalpac</w:t>
+      </w:r>
+      <w:proofErr w:type="spellEnd"/>
+      <w:r>
+        <w:rPr>
+          <w:rFonts w:ascii="Times New Roman" w:hAnsi="Times New Roman" w:cs="Times New Roman"/>
+        </w:rPr>
+        <w:t xml:space="preserve"> / Intertek. “Lifecycle Assessment of the Frugal Bottle.” Independent Report, 2019.</w:t>
       </w:r>
     </w:p>
     <w:p>
@@ -720,12 +1624,20 @@
           <w:szCs w:val="32"/>
         </w:rPr>
       </w:pPr>
+      <w:proofErr w:type="spellStart"/>
       <w:r>
         <w:rPr>
           <w:rFonts w:ascii="Times New Roman" w:hAnsi="Times New Roman" w:cs="Times New Roman"/>
         </w:rPr>
         <w:lastRenderedPageBreak/>
-        <w:t>Pollnitz, Alan, et al. “Incidence of 2,4,6-Trichloroanisole in a Range of Cork Products.” Australian Journal of Grape and Wine Research, vol. 2, 1996, pp. 144–151.</w:t>
+        <w:t>Pollnitz</w:t>
+      </w:r>
+      <w:proofErr w:type="spellEnd"/>
+      <w:r>
+        <w:rPr>
+          <w:rFonts w:ascii="Times New Roman" w:hAnsi="Times New Roman" w:cs="Times New Roman"/>
+        </w:rPr>
+        <w:t>, Alan, et al. “Incidence of 2,4,6-Trichloroanisole in a Range of Cork Products.” Australian Journal of Grape and Wine Research, vol. 2, 1996, pp. 144–151.</w:t>
       </w:r>
     </w:p>
     <w:p/>
@@ -899,6 +1811,14 @@
     </w:pPr>
   </w:p>
 </w:hdr>
+</file>
+
+<file path=word/people.xml><?xml version="1.0" encoding="utf-8"?>
+<w15:people xmlns:wpc="http://schemas.microsoft.com/office/word/2010/wordprocessingCanvas" xmlns:cx="http://schemas.microsoft.com/office/drawing/2014/chartex" xmlns:cx1="http://schemas.microsoft.com/office/drawing/2015/9/8/chartex" xmlns:cx2="http://schemas.microsoft.com/office/drawing/2015/10/21/chartex" xmlns:cx3="http://schemas.microsoft.com/office/drawing/2016/5/9/chartex" xmlns:cx4="http://schemas.microsoft.com/office/drawing/2016/5/10/chartex" xmlns:cx5="http://schemas.microsoft.com/office/drawing/2016/5/11/chartex" xmlns:cx6="http://schemas.microsoft.com/office/drawing/2016/5/12/chartex" xmlns:cx7="http://schemas.microsoft.com/office/drawing/2016/5/13/chartex" xmlns:cx8="http://schemas.microsoft.com/office/drawing/2016/5/14/chartex" xmlns:mc="http://schemas.openxmlformats.org/markup-compatibility/2006" xmlns:aink="http://schemas.microsoft.com/office/drawing/2016/ink" xmlns:am3d="http://schemas.microsoft.com/office/drawing/2017/model3d" xmlns:o="urn:schemas-microsoft-com:office:office" xmlns:oel="http://schemas.microsoft.com/office/2019/extlst" xmlns:r="http://schemas.openxmlformats.org/officeDocument/2006/relationships" xmlns:m="http://schemas.openxmlformats.org/officeDocument/2006/math" xmlns:v="urn:schemas-microsoft-com:vml" xmlns:wp14="http://schemas.microsoft.com/office/word/2010/wordprocessingDrawing" xmlns:wp="http://schemas.openxmlformats.org/drawingml/2006/wordprocessingDrawing" xmlns:w10="urn:schemas-microsoft-com:office:word" xmlns:w="http://schemas.openxmlformats.org/wordprocessingml/2006/main" xmlns:w14="http://schemas.microsoft.com/office/word/2010/wordml" xmlns:w15="http://schemas.microsoft.com/office/word/2012/wordml" xmlns:w16cex="http://schemas.microsoft.com/office/word/2018/wordml/cex" xmlns:w16cid="http://schemas.microsoft.com/office/word/2016/wordml/cid" xmlns:w16="http://schemas.microsoft.com/office/word/2018/wordml" xmlns:w16du="http://schemas.microsoft.com/office/word/2023/wordml/word16du" xmlns:w16sdtdh="http://schemas.microsoft.com/office/word/2020/wordml/sdtdatahash" xmlns:w16sdtfl="http://schemas.microsoft.com/office/word/2024/wordml/sdtformatlock" xmlns:w16se="http://schemas.microsoft.com/office/word/2015/wordml/symex" xmlns:wpg="http://schemas.microsoft.com/office/word/2010/wordprocessingGroup" xmlns:wpi="http://schemas.microsoft.com/office/word/2010/wordprocessingInk" xmlns:wne="http://schemas.microsoft.com/office/word/2006/wordml" xmlns:wps="http://schemas.microsoft.com/office/word/2010/wordprocessingShape" mc:Ignorable="w14 w15 w16se w16cid w16 w16cex w16sdtdh w16sdtfl w16du wp14">
+  <w15:person w15:author="Sarah Payne (RIT Student)">
+    <w15:presenceInfo w15:providerId="AD" w15:userId="S::sap4735@rit.edu::775dff7b-9da2-4fea-8993-981acb691026"/>
+  </w15:person>
+</w15:people>
 </file>
 
 <file path=word/styles.xml><?xml version="1.0" encoding="utf-8"?>
@@ -1504,6 +2424,7 @@
   <w:style w:type="character" w:default="1" w:styleId="DefaultParagraphFont">
     <w:name w:val="Default Paragraph Font"/>
     <w:uiPriority w:val="1"/>
+    <w:semiHidden/>
     <w:unhideWhenUsed/>
   </w:style>
   <w:style w:type="table" w:default="1" w:styleId="TableNormal">
@@ -1860,6 +2781,16 @@
     <w:link w:val="Footer"/>
     <w:uiPriority w:val="99"/>
     <w:rsid w:val="00A73838"/>
+  </w:style>
+  <w:style w:type="paragraph" w:styleId="Revision">
+    <w:name w:val="Revision"/>
+    <w:hidden/>
+    <w:uiPriority w:val="99"/>
+    <w:semiHidden/>
+    <w:rsid w:val="003A2305"/>
+    <w:pPr>
+      <w:spacing w:after="0" w:line="240" w:lineRule="auto"/>
+    </w:pPr>
   </w:style>
 </w:styles>
 </file>

</xml_diff>